<commit_message>
completing day 04 and day 05 as a sub task of assignment day 07
</commit_message>
<xml_diff>
--- a/Day 04/Lab Apply/Assignment Day 04.docx
+++ b/Day 04/Lab Apply/Assignment Day 04.docx
@@ -573,12 +573,120 @@
         </w:rPr>
         <w:t xml:space="preserve"> </w:t>
       </w:r>
+      <w:proofErr w:type="gramStart"/>
       <w:r>
         <w:rPr>
           <w:b/>
           <w:color w:val="FF0000"/>
         </w:rPr>
         <w:t>occurred)</w:t>
+      </w:r>
+      <w:r>
+        <w:rPr>
+          <w:b/>
+          <w:color w:val="FF0000"/>
+        </w:rPr>
+        <w:t xml:space="preserve"> </w:t>
+      </w:r>
+      <w:r>
+        <w:rPr>
+          <w:b/>
+          <w:color w:val="FF0000"/>
+        </w:rPr>
+        <w:t xml:space="preserve">  </w:t>
+      </w:r>
+      <w:proofErr w:type="gramEnd"/>
+      <w:r>
+        <w:rPr>
+          <w:b/>
+          <w:color w:val="FF0000"/>
+        </w:rPr>
+        <w:t xml:space="preserve">                               </w:t>
+      </w:r>
+      <w:r>
+        <w:rPr>
+          <w:b/>
+          <w:color w:val="00B050"/>
+        </w:rPr>
+        <w:t xml:space="preserve">= </w:t>
+      </w:r>
+      <w:r>
+        <w:rPr>
+          <w:b/>
+          <w:color w:val="00B050"/>
+        </w:rPr>
+        <w:t>(</w:t>
+      </w:r>
+      <w:r>
+        <w:rPr>
+          <w:b/>
+          <w:color w:val="00B050"/>
+        </w:rPr>
+        <w:t>0</w:t>
+      </w:r>
+      <w:r>
+        <w:rPr>
+          <w:b/>
+          <w:color w:val="00B050"/>
+        </w:rPr>
+        <w:t xml:space="preserve">: if we implement </w:t>
+      </w:r>
+      <w:proofErr w:type="spellStart"/>
+      <w:r>
+        <w:rPr>
+          <w:b/>
+          <w:color w:val="00B050"/>
+        </w:rPr>
+        <w:t>IComparable</w:t>
+      </w:r>
+      <w:proofErr w:type="spellEnd"/>
+      <w:r>
+        <w:rPr>
+          <w:b/>
+          <w:color w:val="00B050"/>
+        </w:rPr>
+        <w:t>&lt;Employee&gt; | O(</w:t>
+      </w:r>
+      <w:proofErr w:type="spellStart"/>
+      <w:r>
+        <w:rPr>
+          <w:b/>
+          <w:color w:val="00B050"/>
+        </w:rPr>
+        <w:t>nlogn</w:t>
+      </w:r>
+      <w:proofErr w:type="spellEnd"/>
+      <w:proofErr w:type="gramStart"/>
+      <w:r>
+        <w:rPr>
+          <w:b/>
+          <w:color w:val="00B050"/>
+        </w:rPr>
+        <w:t>):if</w:t>
+      </w:r>
+      <w:proofErr w:type="gramEnd"/>
+      <w:r>
+        <w:rPr>
+          <w:b/>
+          <w:color w:val="00B050"/>
+        </w:rPr>
+        <w:t xml:space="preserve"> we Implement </w:t>
+      </w:r>
+      <w:proofErr w:type="spellStart"/>
+      <w:r>
+        <w:rPr>
+          <w:b/>
+          <w:color w:val="00B050"/>
+        </w:rPr>
+        <w:t>IComparable</w:t>
+      </w:r>
+      <w:proofErr w:type="spellEnd"/>
+      <w:r>
+        <w:rPr>
+          <w:b/>
+          <w:color w:val="00B050"/>
+        </w:rPr>
+        <w:t>)</w:t>
       </w:r>
     </w:p>
     <w:p>
@@ -1790,21 +1898,6 @@
 </file>
 
 <file path=customXml/item1.xml><?xml version="1.0" encoding="utf-8"?>
-<p:properties xmlns:p="http://schemas.microsoft.com/office/2006/metadata/properties" xmlns:xsi="http://www.w3.org/2001/XMLSchema-instance" xmlns:pc="http://schemas.microsoft.com/office/infopath/2007/PartnerControls">
-  <documentManagement/>
-</p:properties>
-</file>
-
-<file path=customXml/item2.xml><?xml version="1.0" encoding="utf-8"?>
-<?mso-contentType ?>
-<FormTemplates xmlns="http://schemas.microsoft.com/sharepoint/v3/contenttype/forms">
-  <Display>DocumentLibraryForm</Display>
-  <Edit>DocumentLibraryForm</Edit>
-  <New>DocumentLibraryForm</New>
-</FormTemplates>
-</file>
-
-<file path=customXml/item3.xml><?xml version="1.0" encoding="utf-8"?>
 <ct:contentTypeSchema xmlns:ct="http://schemas.microsoft.com/office/2006/metadata/contentType" xmlns:ma="http://schemas.microsoft.com/office/2006/metadata/properties/metaAttributes" ct:_="" ma:_="" ma:contentTypeName="Document" ma:contentTypeID="0x0101000CA1617483B3BE4CA49E8F8929852254" ma:contentTypeVersion="7" ma:contentTypeDescription="Create a new document." ma:contentTypeScope="" ma:versionID="7c86a7b8edb5a328f2fb321520dc1e64">
   <xsd:schema xmlns:xsd="http://www.w3.org/2001/XMLSchema" xmlns:xs="http://www.w3.org/2001/XMLSchema" xmlns:p="http://schemas.microsoft.com/office/2006/metadata/properties" xmlns:ns2="937d0145-aa4e-4dc2-8e4f-03c49e1cf03a" targetNamespace="http://schemas.microsoft.com/office/2006/metadata/properties" ma:root="true" ma:fieldsID="1e12290254f1915242a1a936eb956230" ns2:_="">
     <xsd:import namespace="937d0145-aa4e-4dc2-8e4f-03c49e1cf03a"/>
@@ -1966,24 +2059,22 @@
 </ct:contentTypeSchema>
 </file>
 
-<file path=customXml/itemProps1.xml><?xml version="1.0" encoding="utf-8"?>
-<ds:datastoreItem xmlns:ds="http://schemas.openxmlformats.org/officeDocument/2006/customXml" ds:itemID="{AB4F0117-8F5F-4EDE-9C68-984025223D4D}">
-  <ds:schemaRefs>
-    <ds:schemaRef ds:uri="http://schemas.microsoft.com/office/2006/metadata/properties"/>
-    <ds:schemaRef ds:uri="http://schemas.microsoft.com/office/infopath/2007/PartnerControls"/>
-  </ds:schemaRefs>
-</ds:datastoreItem>
+<file path=customXml/item2.xml><?xml version="1.0" encoding="utf-8"?>
+<?mso-contentType ?>
+<FormTemplates xmlns="http://schemas.microsoft.com/sharepoint/v3/contenttype/forms">
+  <Display>DocumentLibraryForm</Display>
+  <Edit>DocumentLibraryForm</Edit>
+  <New>DocumentLibraryForm</New>
+</FormTemplates>
 </file>
 
-<file path=customXml/itemProps2.xml><?xml version="1.0" encoding="utf-8"?>
-<ds:datastoreItem xmlns:ds="http://schemas.openxmlformats.org/officeDocument/2006/customXml" ds:itemID="{3B41C686-0F9B-4198-9329-8A9A257F45CE}">
-  <ds:schemaRefs>
-    <ds:schemaRef ds:uri="http://schemas.microsoft.com/sharepoint/v3/contenttype/forms"/>
-  </ds:schemaRefs>
-</ds:datastoreItem>
+<file path=customXml/item3.xml><?xml version="1.0" encoding="utf-8"?>
+<p:properties xmlns:p="http://schemas.microsoft.com/office/2006/metadata/properties" xmlns:xsi="http://www.w3.org/2001/XMLSchema-instance" xmlns:pc="http://schemas.microsoft.com/office/infopath/2007/PartnerControls">
+  <documentManagement/>
+</p:properties>
 </file>
 
-<file path=customXml/itemProps3.xml><?xml version="1.0" encoding="utf-8"?>
+<file path=customXml/itemProps1.xml><?xml version="1.0" encoding="utf-8"?>
 <ds:datastoreItem xmlns:ds="http://schemas.openxmlformats.org/officeDocument/2006/customXml" ds:itemID="{DFA164D9-D302-46B6-981C-4D96CFB8B323}">
   <ds:schemaRefs>
     <ds:schemaRef ds:uri="http://schemas.microsoft.com/office/2006/metadata/contentType"/>
@@ -1999,4 +2090,21 @@
     <ds:schemaRef ds:uri="http://schemas.microsoft.com/internal/obd"/>
   </ds:schemaRefs>
 </ds:datastoreItem>
+</file>
+
+<file path=customXml/itemProps2.xml><?xml version="1.0" encoding="utf-8"?>
+<ds:datastoreItem xmlns:ds="http://schemas.openxmlformats.org/officeDocument/2006/customXml" ds:itemID="{3B41C686-0F9B-4198-9329-8A9A257F45CE}">
+  <ds:schemaRefs>
+    <ds:schemaRef ds:uri="http://schemas.microsoft.com/sharepoint/v3/contenttype/forms"/>
+  </ds:schemaRefs>
+</ds:datastoreItem>
+</file>
+
+<file path=customXml/itemProps3.xml><?xml version="1.0" encoding="utf-8"?>
+<ds:datastoreItem xmlns:ds="http://schemas.openxmlformats.org/officeDocument/2006/customXml" ds:itemID="{AB4F0117-8F5F-4EDE-9C68-984025223D4D}">
+  <ds:schemaRefs>
+    <ds:schemaRef ds:uri="http://schemas.microsoft.com/office/2006/metadata/properties"/>
+    <ds:schemaRef ds:uri="http://schemas.microsoft.com/office/infopath/2007/PartnerControls"/>
+  </ds:schemaRefs>
+</ds:datastoreItem>
 </file>
</xml_diff>